<commit_message>
feat(planning): ajouter un chantier sur un jour deja occupe (vue Salaries)
Depuis la vue Salaries, une journee deja remplie n'offrait aucun moyen
d'ajouter un second chantier : il fallait passer par la vue Chantiers.

Un bouton « + » discret apparait au survol d'une cellule occupee et ouvre
l'affectation pre-remplie (salarie verrouille, date du jour). L'option est
aussi ajoutee au menu clic-droit. Le second chantier s'empile sur une
nouvelle ligne du salarie (computeLanes, deja en place).

Co-Authored-By: Claude Opus 4.8 <noreply@anthropic.com>
</commit_message>
<xml_diff>
--- a/Suivi_ameliorations.docx
+++ b/Suivi_ameliorations.docx
@@ -12,639 +12,152 @@
         <w:spacing w:after="0" w:line="0" w:lineRule="atLeast"/>
       </w:pPr>
       <w:r>
-        <w:t xml:space="preserve">1. **Pour l'analytique réalisé sur les fournitures il faut qu'on mette en place la connexion vers ma boite mail "achat" </w:t>
-      </w:r>
-      <w:proofErr w:type="spellStart"/>
-      <w:r>
-        <w:t>la</w:t>
-      </w:r>
-      <w:proofErr w:type="spellEnd"/>
-      <w:r>
-        <w:t xml:space="preserve"> ou </w:t>
-      </w:r>
-      <w:proofErr w:type="gramStart"/>
-      <w:r>
-        <w:t>toutes les confirmation</w:t>
-      </w:r>
-      <w:proofErr w:type="gramEnd"/>
-      <w:r>
-        <w:t xml:space="preserve"> de commande </w:t>
-      </w:r>
-      <w:proofErr w:type="gramStart"/>
-      <w:r>
-        <w:t>arrivent .</w:t>
-      </w:r>
-      <w:proofErr w:type="gramEnd"/>
-      <w:r>
-        <w:t xml:space="preserve"> Il </w:t>
-      </w:r>
-      <w:proofErr w:type="spellStart"/>
-      <w:r>
-        <w:t>faudras</w:t>
-      </w:r>
-      <w:proofErr w:type="spellEnd"/>
-      <w:r>
-        <w:t xml:space="preserve"> également que l'on puisse voir si un achat a été saisie sans montant qu'il reste à les inclure dans l'analytique . Cela me mettra une alerte pour </w:t>
-      </w:r>
-      <w:proofErr w:type="spellStart"/>
-      <w:r>
-        <w:t>allé</w:t>
-      </w:r>
-      <w:proofErr w:type="spellEnd"/>
-      <w:r>
-        <w:t xml:space="preserve"> récupérer les montants manquants .**</w:t>
-      </w:r>
-    </w:p>
-    <w:p>
-      <w:pPr>
-        <w:spacing w:after="0" w:line="0" w:lineRule="atLeast"/>
-      </w:pPr>
-      <w:r>
-        <w:t xml:space="preserve">2. **Dans le fil de discussion d'un chantier, avoir la </w:t>
-      </w:r>
-      <w:proofErr w:type="spellStart"/>
-      <w:r>
-        <w:t>possiblité</w:t>
-      </w:r>
-      <w:proofErr w:type="spellEnd"/>
-      <w:r>
-        <w:t xml:space="preserve"> d'identifier une personne en faisant @nomducollaborateur et ajouter un bouton pour les réactions par </w:t>
-      </w:r>
-      <w:proofErr w:type="spellStart"/>
-      <w:r>
-        <w:t>émoticones</w:t>
-      </w:r>
-      <w:proofErr w:type="spellEnd"/>
-      <w:r>
-        <w:t>**</w:t>
+        <w:t>1. **Pour l'analytique réalisé sur les fournitures il faut qu'on mette en place la connexion vers ma boite mail "achat" la ou toutes les confirmation de commande arrivent . Il faudras également que l'on puisse voir si un achat a été saisie sans montant qu'il reste à les inclure dans l'analytique . Cela me mettra une alerte pour allé récupérer les montants manquants .**</w:t>
+      </w:r>
+    </w:p>
+    <w:p>
+      <w:pPr>
+        <w:spacing w:after="0" w:line="0" w:lineRule="atLeast"/>
+      </w:pPr>
+      <w:r>
+        <w:t>2. **Dans le fil de discussion d'un chantier, avoir la possiblité d'identifier une personne en faisant @nomducollaborateur et ajouter un bouton pour les réactions par émoticones**</w:t>
       </w:r>
     </w:p>
     <w:p/>
+    <w:p>
+      <w:pPr>
+        <w:spacing w:after="0" w:line="0" w:lineRule="atLeast"/>
+        <w:rPr>
+          <w:lang w:val="en-US"/>
+        </w:rPr>
+      </w:pPr>
+    </w:p>
+    <w:p>
+      <w:pPr>
+        <w:spacing w:after="0" w:line="0" w:lineRule="atLeast"/>
+        <w:rPr>
+          <w:b/>
+          <w:bCs/>
+        </w:rPr>
+      </w:pPr>
+      <w:r>
+        <w:rPr>
+          <w:b/>
+          <w:bCs/>
+        </w:rPr>
+        <w:t>MODIFICATIONS ATELIER MZ BOIS</w:t>
+      </w:r>
+    </w:p>
+    <w:p>
+      <w:pPr>
+        <w:spacing w:after="0" w:line="0" w:lineRule="atLeast"/>
+        <w:rPr>
+          <w:b/>
+          <w:bCs/>
+        </w:rPr>
+      </w:pPr>
+      <w:r>
+        <w:rPr>
+          <w:b/>
+          <w:bCs/>
+        </w:rPr>
+        <w:t xml:space="preserve">Dernière mise à jour : </w:t>
+      </w:r>
+    </w:p>
+    <w:p>
+      <w:pPr>
+        <w:spacing w:after="0" w:line="0" w:lineRule="atLeast"/>
+        <w:rPr>
+          <w:b/>
+          <w:bCs/>
+        </w:rPr>
+      </w:pPr>
+    </w:p>
+    <w:p>
+      <w:pPr>
+        <w:spacing w:after="0" w:line="0" w:lineRule="atLeast"/>
+        <w:rPr>
+          <w:b/>
+          <w:bCs/>
+        </w:rPr>
+      </w:pPr>
+      <w:r>
+        <w:rPr>
+          <w:rFonts w:ascii="Arial" w:hAnsi="Arial" w:cs="Arial"/>
+          <w:b/>
+          <w:bCs/>
+        </w:rPr>
+        <w:t>════════════════════════════════</w:t>
+      </w:r>
+    </w:p>
+    <w:p>
+      <w:pPr>
+        <w:spacing w:after="0" w:line="0" w:lineRule="atLeast"/>
+        <w:rPr>
+          <w:b/>
+          <w:bCs/>
+        </w:rPr>
+      </w:pPr>
+      <w:r>
+        <w:rPr>
+          <w:b/>
+          <w:bCs/>
+        </w:rPr>
+        <w:t>TABLEAUX DE BORDS</w:t>
+      </w:r>
+    </w:p>
+    <w:p>
+      <w:pPr>
+        <w:pStyle w:val="Paragraphedeliste"/>
+        <w:numPr>
+          <w:ilvl w:val="0"/>
+          <w:numId w:val="2"/>
+        </w:numPr>
+      </w:pPr>
+      <w:r>
+        <w:t xml:space="preserve">ALERTES : </w:t>
+      </w:r>
+      <w:r>
+        <w:t xml:space="preserve">Lorsque l’on clique sur l’alerte, on arrive sur une page qui ne correspond pas forcément à l’alerte exemple : 3 départs atelier dans moins de 7 jours = on arrive sur la page </w:t>
+      </w:r>
+      <w:r>
+        <w:t>des chantiers</w:t>
+      </w:r>
+      <w:r>
+        <w:t xml:space="preserve"> avec </w:t>
+      </w:r>
+      <w:r>
+        <w:t>tous</w:t>
+      </w:r>
+      <w:r>
+        <w:t xml:space="preserve"> les chantier . Ce n’est pas </w:t>
+      </w:r>
+      <w:r>
+        <w:t>logique.</w:t>
+      </w:r>
+      <w:r>
+        <w:t xml:space="preserve"> Idem pour les autres alertes, il doit y avoir une logique lorsque l’on clique sur l’alerte on arrive sur </w:t>
+      </w:r>
+      <w:r>
+        <w:t>la page concernée</w:t>
+      </w:r>
+      <w:r>
+        <w:t xml:space="preserve"> avec </w:t>
+      </w:r>
+      <w:r>
+        <w:t>les informations concernées</w:t>
+      </w:r>
+      <w:r>
+        <w:t xml:space="preserve"> par </w:t>
+      </w:r>
+      <w:r>
+        <w:t>l’alerte.</w:t>
+      </w:r>
+    </w:p>
     <w:p/>
     <w:p>
       <w:pPr>
         <w:spacing w:after="0" w:line="0" w:lineRule="atLeast"/>
-      </w:pPr>
-      <w:r>
-        <w:t>23\. Fiche chantier — onglet Réunion de chantiers :</w:t>
-      </w:r>
-    </w:p>
-    <w:p>
-      <w:pPr>
-        <w:spacing w:after="0" w:line="0" w:lineRule="atLeast"/>
-      </w:pPr>
-    </w:p>
-    <w:p>
-      <w:pPr>
-        <w:spacing w:after="0" w:line="0" w:lineRule="atLeast"/>
-      </w:pPr>
-      <w:r>
-        <w:t xml:space="preserve">Clic sur le titre de la réunion </w:t>
-      </w:r>
-    </w:p>
-    <w:p>
-      <w:pPr>
-        <w:spacing w:after="0" w:line="0" w:lineRule="atLeast"/>
-      </w:pPr>
-    </w:p>
-    <w:p>
-      <w:pPr>
-        <w:spacing w:after="0" w:line="0" w:lineRule="atLeast"/>
-      </w:pPr>
-      <w:r>
-        <w:t xml:space="preserve">(ex: "Réunion de chantiers du 15/06/2026") </w:t>
-      </w:r>
-    </w:p>
-    <w:p>
-      <w:pPr>
-        <w:spacing w:after="0" w:line="0" w:lineRule="atLeast"/>
-      </w:pPr>
-    </w:p>
-    <w:p>
-      <w:pPr>
-        <w:spacing w:after="0" w:line="0" w:lineRule="atLeast"/>
-      </w:pPr>
-      <w:r>
-        <w:t>→ ouvre le modal d'édition de la réunion</w:t>
-      </w:r>
-    </w:p>
-    <w:p>
-      <w:pPr>
-        <w:spacing w:after="0" w:line="0" w:lineRule="atLeast"/>
-      </w:pPr>
-    </w:p>
-    <w:p>
-      <w:pPr>
-        <w:spacing w:after="0" w:line="0" w:lineRule="atLeast"/>
-      </w:pPr>
-      <w:r>
-        <w:t>(date, notes, actions)</w:t>
-      </w:r>
-    </w:p>
-    <w:p>
-      <w:pPr>
-        <w:spacing w:after="0" w:line="0" w:lineRule="atLeast"/>
-      </w:pPr>
-    </w:p>
-    <w:p>
-      <w:pPr>
-        <w:spacing w:after="0" w:line="0" w:lineRule="atLeast"/>
-      </w:pPr>
-      <w:r>
-        <w:t xml:space="preserve">Supprimer tout bouton "Modifier" séparé </w:t>
-      </w:r>
-    </w:p>
-    <w:p>
-      <w:pPr>
-        <w:spacing w:after="0" w:line="0" w:lineRule="atLeast"/>
-      </w:pPr>
-    </w:p>
-    <w:p>
-      <w:pPr>
-        <w:spacing w:after="0" w:line="0" w:lineRule="atLeast"/>
-      </w:pPr>
-      <w:r>
-        <w:t>si présent — le clic sur le titre suffit.</w:t>
-      </w:r>
-    </w:p>
-    <w:p>
-      <w:pPr>
-        <w:spacing w:after="0" w:line="0" w:lineRule="atLeast"/>
-      </w:pPr>
-    </w:p>
-    <w:p>
-      <w:pPr>
-        <w:spacing w:after="0" w:line="0" w:lineRule="atLeast"/>
-      </w:pPr>
-    </w:p>
-    <w:p>
-      <w:pPr>
-        <w:spacing w:after="0" w:line="0" w:lineRule="atLeast"/>
-      </w:pPr>
-    </w:p>
-    <w:p>
-      <w:pPr>
-        <w:spacing w:after="0" w:line="0" w:lineRule="atLeast"/>
-      </w:pPr>
-      <w:r>
-        <w:t>24\. Onglet Chantiers — liste :</w:t>
-      </w:r>
-    </w:p>
-    <w:p>
-      <w:pPr>
-        <w:spacing w:after="0" w:line="0" w:lineRule="atLeast"/>
-      </w:pPr>
-    </w:p>
-    <w:p>
-      <w:pPr>
-        <w:spacing w:after="0" w:line="0" w:lineRule="atLeast"/>
-      </w:pPr>
-      <w:r>
-        <w:t xml:space="preserve">Ajouter un </w:t>
-      </w:r>
-      <w:proofErr w:type="spellStart"/>
-      <w:r>
-        <w:t>toggle</w:t>
-      </w:r>
-      <w:proofErr w:type="spellEnd"/>
-      <w:r>
-        <w:t xml:space="preserve"> de tri par numéro de chantier :</w:t>
-      </w:r>
-    </w:p>
-    <w:p>
-      <w:pPr>
-        <w:spacing w:after="0" w:line="0" w:lineRule="atLeast"/>
-      </w:pPr>
-    </w:p>
-    <w:p>
-      <w:pPr>
-        <w:spacing w:after="0" w:line="0" w:lineRule="atLeast"/>
-      </w:pPr>
-      <w:r>
-        <w:t>\- Ordre décroissant par défaut (le plus récent en haut)</w:t>
-      </w:r>
-    </w:p>
-    <w:p>
-      <w:pPr>
-        <w:spacing w:after="0" w:line="0" w:lineRule="atLeast"/>
-      </w:pPr>
-    </w:p>
-    <w:p>
-      <w:pPr>
-        <w:spacing w:after="0" w:line="0" w:lineRule="atLeast"/>
-      </w:pPr>
-      <w:r>
-        <w:t>\- Ordre croissant (le plus ancien en haut)</w:t>
-      </w:r>
-    </w:p>
-    <w:p>
-      <w:pPr>
-        <w:spacing w:after="0" w:line="0" w:lineRule="atLeast"/>
-      </w:pPr>
-    </w:p>
-    <w:p>
-      <w:pPr>
-        <w:spacing w:after="0" w:line="0" w:lineRule="atLeast"/>
-      </w:pPr>
-      <w:r>
-        <w:t xml:space="preserve">\- Le tri se base sur les 3 premiers chiffres </w:t>
-      </w:r>
-    </w:p>
-    <w:p>
-      <w:pPr>
-        <w:spacing w:after="0" w:line="0" w:lineRule="atLeast"/>
-      </w:pPr>
-    </w:p>
-    <w:p>
-      <w:pPr>
-        <w:spacing w:after="0" w:line="0" w:lineRule="atLeast"/>
-      </w:pPr>
-      <w:r>
-        <w:t>&amp;#x20; du code chantier (ex: 365 &gt; 291 &gt; 228)</w:t>
-      </w:r>
-    </w:p>
-    <w:p>
-      <w:pPr>
-        <w:spacing w:after="0" w:line="0" w:lineRule="atLeast"/>
-      </w:pPr>
-    </w:p>
-    <w:p>
-      <w:pPr>
-        <w:spacing w:after="0" w:line="0" w:lineRule="atLeast"/>
-      </w:pPr>
-      <w:r>
-        <w:t xml:space="preserve">\- Bouton </w:t>
-      </w:r>
-      <w:proofErr w:type="spellStart"/>
-      <w:r>
-        <w:t>toggle</w:t>
-      </w:r>
-      <w:proofErr w:type="spellEnd"/>
-      <w:r>
-        <w:t xml:space="preserve"> simple : "↑ Croissant / ↓ Décroissant"</w:t>
-      </w:r>
-    </w:p>
-    <w:p>
-      <w:pPr>
-        <w:spacing w:after="0" w:line="0" w:lineRule="atLeast"/>
-      </w:pPr>
-    </w:p>
-    <w:p>
-      <w:pPr>
-        <w:spacing w:after="0" w:line="0" w:lineRule="atLeast"/>
-      </w:pPr>
-      <w:r>
-        <w:t>&amp;#x20; affiché à côté de la barre de recherche</w:t>
-      </w:r>
-    </w:p>
-    <w:p>
-      <w:pPr>
-        <w:spacing w:after="0" w:line="0" w:lineRule="atLeast"/>
-      </w:pPr>
-    </w:p>
-    <w:p>
-      <w:pPr>
-        <w:spacing w:after="0" w:line="0" w:lineRule="atLeast"/>
-      </w:pPr>
-    </w:p>
-    <w:p>
-      <w:pPr>
-        <w:spacing w:after="0" w:line="0" w:lineRule="atLeast"/>
-      </w:pPr>
-    </w:p>
-    <w:p>
-      <w:pPr>
-        <w:spacing w:after="0" w:line="0" w:lineRule="atLeast"/>
-      </w:pPr>
-      <w:r>
-        <w:t>25\. Bibliothèques — modal article (création + édition) :</w:t>
-      </w:r>
-    </w:p>
-    <w:p>
-      <w:pPr>
-        <w:spacing w:after="0" w:line="0" w:lineRule="atLeast"/>
-      </w:pPr>
-    </w:p>
-    <w:p>
-      <w:pPr>
-        <w:spacing w:after="0" w:line="0" w:lineRule="atLeast"/>
-      </w:pPr>
-      <w:r>
-        <w:t>Revoir la mise en page générale du modal :</w:t>
-      </w:r>
-    </w:p>
-    <w:p>
-      <w:pPr>
-        <w:spacing w:after="0" w:line="0" w:lineRule="atLeast"/>
-      </w:pPr>
-    </w:p>
-    <w:p>
-      <w:pPr>
-        <w:spacing w:after="0" w:line="0" w:lineRule="atLeast"/>
-      </w:pPr>
-    </w:p>
-    <w:p>
-      <w:pPr>
-        <w:spacing w:after="0" w:line="0" w:lineRule="atLeast"/>
-      </w:pPr>
-    </w:p>
-    <w:p>
-      <w:pPr>
-        <w:spacing w:after="0" w:line="0" w:lineRule="atLeast"/>
-      </w:pPr>
-      <w:r>
-        <w:t xml:space="preserve">Le menu déroulant fournisseurs dépasse </w:t>
-      </w:r>
-    </w:p>
-    <w:p>
-      <w:pPr>
-        <w:spacing w:after="0" w:line="0" w:lineRule="atLeast"/>
-      </w:pPr>
-    </w:p>
-    <w:p>
-      <w:pPr>
-        <w:spacing w:after="0" w:line="0" w:lineRule="atLeast"/>
-      </w:pPr>
-      <w:r>
-        <w:t xml:space="preserve">&amp;#x20;  du modal → le contraindre dans la hauteur </w:t>
-      </w:r>
-    </w:p>
-    <w:p>
-      <w:pPr>
-        <w:spacing w:after="0" w:line="0" w:lineRule="atLeast"/>
-      </w:pPr>
-    </w:p>
-    <w:p>
-      <w:pPr>
-        <w:spacing w:after="0" w:line="0" w:lineRule="atLeast"/>
-      </w:pPr>
-      <w:r>
-        <w:t>&amp;#x20;  du modal avec scroll interne sur la liste</w:t>
-      </w:r>
-    </w:p>
-    <w:p>
-      <w:pPr>
-        <w:spacing w:after="0" w:line="0" w:lineRule="atLeast"/>
-      </w:pPr>
-    </w:p>
-    <w:p>
-      <w:pPr>
-        <w:spacing w:after="0" w:line="0" w:lineRule="atLeast"/>
-      </w:pPr>
-      <w:r>
-        <w:t>&amp;#x20;  (max-</w:t>
-      </w:r>
-      <w:proofErr w:type="spellStart"/>
-      <w:r>
-        <w:t>height</w:t>
-      </w:r>
-      <w:proofErr w:type="spellEnd"/>
-      <w:r>
-        <w:t xml:space="preserve"> sur la </w:t>
-      </w:r>
-      <w:proofErr w:type="spellStart"/>
-      <w:r>
-        <w:t>dropdown</w:t>
-      </w:r>
-      <w:proofErr w:type="spellEnd"/>
-      <w:r>
-        <w:t>)</w:t>
-      </w:r>
-    </w:p>
-    <w:p>
-      <w:pPr>
-        <w:spacing w:after="0" w:line="0" w:lineRule="atLeast"/>
-      </w:pPr>
-    </w:p>
-    <w:p>
-      <w:pPr>
-        <w:spacing w:after="0" w:line="0" w:lineRule="atLeast"/>
-      </w:pPr>
-    </w:p>
-    <w:p>
-      <w:pPr>
-        <w:spacing w:after="0" w:line="0" w:lineRule="atLeast"/>
-      </w:pPr>
-    </w:p>
-    <w:p>
-      <w:pPr>
-        <w:spacing w:after="0" w:line="0" w:lineRule="atLeast"/>
-      </w:pPr>
-      <w:r>
-        <w:t>Mise en page générale à retravailler :</w:t>
-      </w:r>
-    </w:p>
-    <w:p>
-      <w:pPr>
-        <w:spacing w:after="0" w:line="0" w:lineRule="atLeast"/>
-      </w:pPr>
-    </w:p>
-    <w:p>
-      <w:pPr>
-        <w:spacing w:after="0" w:line="0" w:lineRule="atLeast"/>
-      </w:pPr>
-      <w:r>
-        <w:t>&amp;#x20;  - Champs Nom + Typologie sur la même ligne ✓ (ok)</w:t>
-      </w:r>
-    </w:p>
-    <w:p>
-      <w:pPr>
-        <w:spacing w:after="0" w:line="0" w:lineRule="atLeast"/>
-      </w:pPr>
-    </w:p>
-    <w:p>
-      <w:pPr>
-        <w:spacing w:after="0" w:line="0" w:lineRule="atLeast"/>
-      </w:pPr>
-      <w:r>
-        <w:t>&amp;#x20;  - Description en pleine largeur ✓ (ok)</w:t>
-      </w:r>
-    </w:p>
-    <w:p>
-      <w:pPr>
-        <w:spacing w:after="0" w:line="0" w:lineRule="atLeast"/>
-      </w:pPr>
-    </w:p>
-    <w:p>
-      <w:pPr>
-        <w:spacing w:after="0" w:line="0" w:lineRule="atLeast"/>
-      </w:pPr>
-      <w:r>
-        <w:t>&amp;#x20;  - Prix + Unité sur la même ligne ✓ (ok)</w:t>
-      </w:r>
-    </w:p>
-    <w:p>
-      <w:pPr>
-        <w:spacing w:after="0" w:line="0" w:lineRule="atLeast"/>
-      </w:pPr>
-    </w:p>
-    <w:p>
-      <w:pPr>
-        <w:spacing w:after="0" w:line="0" w:lineRule="atLeast"/>
-      </w:pPr>
-      <w:r>
-        <w:t xml:space="preserve">&amp;#x20;  - Fournisseurs : la liste </w:t>
-      </w:r>
-      <w:proofErr w:type="spellStart"/>
-      <w:r>
-        <w:t>autocomplete</w:t>
-      </w:r>
-      <w:proofErr w:type="spellEnd"/>
-      <w:r>
-        <w:t xml:space="preserve"> doit </w:t>
-      </w:r>
-    </w:p>
-    <w:p>
-      <w:pPr>
-        <w:spacing w:after="0" w:line="0" w:lineRule="atLeast"/>
-      </w:pPr>
-    </w:p>
-    <w:p>
-      <w:pPr>
-        <w:spacing w:after="0" w:line="0" w:lineRule="atLeast"/>
-      </w:pPr>
-      <w:r>
-        <w:t xml:space="preserve">&amp;#x20;    s'afficher EN DESSOUS du champ de recherche </w:t>
-      </w:r>
-    </w:p>
-    <w:p>
-      <w:pPr>
-        <w:spacing w:after="0" w:line="0" w:lineRule="atLeast"/>
-      </w:pPr>
-    </w:p>
-    <w:p>
-      <w:pPr>
-        <w:spacing w:after="0" w:line="0" w:lineRule="atLeast"/>
-      </w:pPr>
-      <w:r>
-        <w:t>&amp;#x20;    mais DANS le modal (pas déborder en dehors)</w:t>
-      </w:r>
-    </w:p>
-    <w:p>
-      <w:pPr>
-        <w:spacing w:after="0" w:line="0" w:lineRule="atLeast"/>
-      </w:pPr>
-    </w:p>
-    <w:p>
-      <w:pPr>
-        <w:spacing w:after="0" w:line="0" w:lineRule="atLeast"/>
-      </w:pPr>
-      <w:r>
-        <w:t xml:space="preserve">&amp;#x20;  - Hauteur max du modal : 85vh avec scroll </w:t>
-      </w:r>
-    </w:p>
-    <w:p>
-      <w:pPr>
-        <w:spacing w:after="0" w:line="0" w:lineRule="atLeast"/>
-      </w:pPr>
-    </w:p>
-    <w:p>
-      <w:pPr>
-        <w:spacing w:after="0" w:line="0" w:lineRule="atLeast"/>
-      </w:pPr>
-      <w:r>
-        <w:t>&amp;#x20;    interne si contenu trop long</w:t>
-      </w:r>
-    </w:p>
-    <w:p>
-      <w:pPr>
-        <w:spacing w:after="0" w:line="0" w:lineRule="atLeast"/>
-      </w:pPr>
-    </w:p>
-    <w:p>
-      <w:pPr>
-        <w:spacing w:after="0" w:line="0" w:lineRule="atLeast"/>
-      </w:pPr>
-      <w:r>
-        <w:t xml:space="preserve">&amp;#x20;  - La liste </w:t>
-      </w:r>
-      <w:proofErr w:type="spellStart"/>
-      <w:r>
-        <w:t>dropdown</w:t>
-      </w:r>
-      <w:proofErr w:type="spellEnd"/>
-      <w:r>
-        <w:t xml:space="preserve"> fournisseurs : </w:t>
-      </w:r>
-    </w:p>
-    <w:p>
-      <w:pPr>
-        <w:spacing w:after="0" w:line="0" w:lineRule="atLeast"/>
-      </w:pPr>
-    </w:p>
-    <w:p>
-      <w:pPr>
-        <w:spacing w:after="0" w:line="0" w:lineRule="atLeast"/>
-        <w:rPr>
-          <w:lang w:val="en-US"/>
-        </w:rPr>
-      </w:pPr>
-      <w:r>
-        <w:rPr>
-          <w:lang w:val="en-US"/>
-        </w:rPr>
-        <w:t>&amp;#x20;    max-height 160px + scroll interne</w:t>
-      </w:r>
-    </w:p>
-    <w:p>
-      <w:pPr>
-        <w:spacing w:after="0" w:line="0" w:lineRule="atLeast"/>
-        <w:rPr>
-          <w:lang w:val="en-US"/>
-        </w:rPr>
-      </w:pPr>
-    </w:p>
-    <w:p>
-      <w:pPr>
-        <w:spacing w:after="0" w:line="0" w:lineRule="atLeast"/>
-        <w:rPr>
-          <w:b/>
-          <w:bCs/>
-        </w:rPr>
-      </w:pPr>
-      <w:r>
-        <w:rPr>
-          <w:b/>
-          <w:bCs/>
-        </w:rPr>
-        <w:t>MODIFICATIONS ATELIER MZ BOIS</w:t>
-      </w:r>
-    </w:p>
-    <w:p>
-      <w:pPr>
-        <w:spacing w:after="0" w:line="0" w:lineRule="atLeast"/>
-        <w:rPr>
-          <w:b/>
-          <w:bCs/>
-        </w:rPr>
-      </w:pPr>
-      <w:r>
-        <w:rPr>
-          <w:b/>
-          <w:bCs/>
-        </w:rPr>
-        <w:t xml:space="preserve">Dernière mise à jour : </w:t>
-      </w:r>
-      <w:r>
-        <w:rPr>
-          <w:b/>
-          <w:bCs/>
-        </w:rPr>
-        <w:t>10/07/2026</w:t>
-      </w:r>
-    </w:p>
-    <w:p>
-      <w:pPr>
-        <w:spacing w:after="0" w:line="0" w:lineRule="atLeast"/>
-        <w:rPr>
-          <w:b/>
-          <w:bCs/>
-        </w:rPr>
-      </w:pPr>
-    </w:p>
-    <w:p>
-      <w:pPr>
-        <w:spacing w:after="0" w:line="0" w:lineRule="atLeast"/>
         <w:rPr>
           <w:b/>
           <w:bCs/>
@@ -660,29 +173,84 @@
       </w:r>
     </w:p>
     <w:p>
-      <w:pPr>
-        <w:spacing w:after="0" w:line="0" w:lineRule="atLeast"/>
-        <w:rPr>
-          <w:b/>
-          <w:bCs/>
-        </w:rPr>
-      </w:pPr>
-      <w:r>
-        <w:rPr>
-          <w:b/>
-          <w:bCs/>
-        </w:rPr>
-        <w:t xml:space="preserve">POINT 1 — </w:t>
-      </w:r>
-      <w:r>
-        <w:rPr>
-          <w:b/>
-          <w:bCs/>
-        </w:rPr>
-        <w:t>PLANING – VUE SALARIES</w:t>
+      <w:r>
+        <w:rPr>
+          <w:b/>
+          <w:bCs/>
+        </w:rPr>
+        <w:t>MENU DE GAUCHE</w:t>
+      </w:r>
+    </w:p>
+    <w:p>
+      <w:pPr>
+        <w:pStyle w:val="Paragraphedeliste"/>
+        <w:numPr>
+          <w:ilvl w:val="0"/>
+          <w:numId w:val="2"/>
+        </w:numPr>
+      </w:pPr>
+      <w:r>
+        <w:t xml:space="preserve">L’onglet Taches apparait sous le </w:t>
+      </w:r>
+      <w:r>
+        <w:t>planning</w:t>
+      </w:r>
+      <w:r>
+        <w:t xml:space="preserve"> dans le menu à gauche .. Ca ne sert a rien. Quand on clique dessus ça nous </w:t>
+      </w:r>
+      <w:r>
+        <w:t>emmène</w:t>
+      </w:r>
+      <w:r>
+        <w:t xml:space="preserve"> sur le tableau de bord …</w:t>
       </w:r>
     </w:p>
     <w:p/>
+    <w:p>
+      <w:pPr>
+        <w:spacing w:after="0" w:line="0" w:lineRule="atLeast"/>
+        <w:rPr>
+          <w:b/>
+          <w:bCs/>
+        </w:rPr>
+      </w:pPr>
+      <w:r>
+        <w:rPr>
+          <w:rFonts w:ascii="Arial" w:hAnsi="Arial" w:cs="Arial"/>
+          <w:b/>
+          <w:bCs/>
+        </w:rPr>
+        <w:t>════════════════════════════════</w:t>
+      </w:r>
+    </w:p>
+    <w:p>
+      <w:pPr>
+        <w:spacing w:after="0" w:line="0" w:lineRule="atLeast"/>
+        <w:rPr>
+          <w:b/>
+          <w:bCs/>
+        </w:rPr>
+      </w:pPr>
+      <w:r>
+        <w:rPr>
+          <w:b/>
+          <w:bCs/>
+        </w:rPr>
+        <w:t>PLANING</w:t>
+      </w:r>
+    </w:p>
+    <w:p>
+      <w:pPr>
+        <w:pStyle w:val="Paragraphedeliste"/>
+        <w:numPr>
+          <w:ilvl w:val="0"/>
+          <w:numId w:val="1"/>
+        </w:numPr>
+      </w:pPr>
+      <w:r>
+        <w:t>Plusieurs chantier pour le même salarié le même jour.</w:t>
+      </w:r>
+    </w:p>
     <w:p/>
     <w:p>
       <w:pPr>
@@ -694,144 +262,120 @@
       </w:pPr>
       <w:r>
         <w:rPr>
-          <w:b/>
-          <w:bCs/>
-        </w:rPr>
-        <w:t xml:space="preserve">Lis le fichier </w:t>
-      </w:r>
-      <w:r>
-        <w:rPr>
-          <w:b/>
-          <w:bCs/>
-        </w:rPr>
-        <w:t>260710-Ameliorations.docx</w:t>
-      </w:r>
-      <w:r>
-        <w:rPr>
-          <w:b/>
-          <w:bCs/>
-        </w:rPr>
-        <w:t xml:space="preserve"> </w:t>
-      </w:r>
-    </w:p>
-    <w:p>
-      <w:pPr>
-        <w:spacing w:after="0" w:line="0" w:lineRule="atLeast"/>
-        <w:rPr>
-          <w:b/>
-          <w:bCs/>
-        </w:rPr>
-      </w:pPr>
-      <w:proofErr w:type="gramStart"/>
-      <w:r>
-        <w:rPr>
-          <w:b/>
-          <w:bCs/>
-        </w:rPr>
-        <w:t>dans</w:t>
-      </w:r>
-      <w:proofErr w:type="gramEnd"/>
-      <w:r>
-        <w:rPr>
-          <w:b/>
-          <w:bCs/>
-        </w:rPr>
-        <w:t xml:space="preserve"> le dossier du projet et applique </w:t>
-      </w:r>
-    </w:p>
-    <w:p>
-      <w:pPr>
-        <w:spacing w:after="0" w:line="0" w:lineRule="atLeast"/>
-        <w:rPr>
-          <w:b/>
-          <w:bCs/>
-        </w:rPr>
-      </w:pPr>
-      <w:proofErr w:type="gramStart"/>
-      <w:r>
-        <w:rPr>
-          <w:b/>
-          <w:bCs/>
-        </w:rPr>
+          <w:rFonts w:ascii="Arial" w:hAnsi="Arial" w:cs="Arial"/>
+          <w:b/>
+          <w:bCs/>
+        </w:rPr>
+        <w:t>════════════════════════════════</w:t>
+      </w:r>
+    </w:p>
+    <w:p>
+      <w:pPr>
+        <w:spacing w:after="0" w:line="0" w:lineRule="atLeast"/>
+        <w:rPr>
+          <w:b/>
+          <w:bCs/>
+        </w:rPr>
+      </w:pPr>
+      <w:r>
+        <w:rPr>
+          <w:b/>
+          <w:bCs/>
+        </w:rPr>
+        <w:t>FIL D’ACTU</w:t>
+      </w:r>
+    </w:p>
+    <w:p>
+      <w:pPr>
+        <w:pStyle w:val="Paragraphedeliste"/>
+        <w:numPr>
+          <w:ilvl w:val="0"/>
+          <w:numId w:val="1"/>
+        </w:numPr>
+        <w:spacing w:after="0" w:line="0" w:lineRule="atLeast"/>
+      </w:pPr>
+      <w:r>
+        <w:t>Il faut imaginer que nous traitons une 40 aines de chantier en simultané. Le fil d’actu va être vite plein. Que me conseil tu pour avoir un affichage qui soit parlant et pas trop pollué par le nombre de chantier ?</w:t>
+      </w:r>
+    </w:p>
+    <w:p>
+      <w:pPr>
+        <w:spacing w:after="0" w:line="0" w:lineRule="atLeast"/>
+      </w:pPr>
+    </w:p>
+    <w:p>
+      <w:pPr>
+        <w:spacing w:after="0" w:line="0" w:lineRule="atLeast"/>
+      </w:pPr>
+    </w:p>
+    <w:p>
+      <w:pPr>
+        <w:spacing w:after="0" w:line="0" w:lineRule="atLeast"/>
+        <w:rPr>
+          <w:b/>
+          <w:bCs/>
+        </w:rPr>
+      </w:pPr>
+      <w:r>
+        <w:rPr>
+          <w:rFonts w:ascii="Arial" w:hAnsi="Arial" w:cs="Arial"/>
+          <w:b/>
+          <w:bCs/>
+        </w:rPr>
+        <w:t>════════════════════════════════</w:t>
+      </w:r>
+    </w:p>
+    <w:p>
+      <w:pPr>
+        <w:spacing w:after="0" w:line="0" w:lineRule="atLeast"/>
+        <w:rPr>
+          <w:b/>
+          <w:bCs/>
+        </w:rPr>
+      </w:pPr>
+      <w:r>
+        <w:rPr>
+          <w:b/>
+          <w:bCs/>
+        </w:rPr>
+        <w:t xml:space="preserve">POINT </w:t>
+      </w:r>
+      <w:r>
+        <w:rPr>
+          <w:b/>
+          <w:bCs/>
+        </w:rPr>
+        <w:t>5</w:t>
+      </w:r>
+      <w:r>
+        <w:rPr>
+          <w:b/>
+          <w:bCs/>
+        </w:rPr>
+        <w:t xml:space="preserve"> —</w:t>
+      </w:r>
+      <w:r>
+        <w:rPr>
+          <w:b/>
+          <w:bCs/>
+        </w:rPr>
+        <w:t xml:space="preserve"> REUNION DE CHANTIER</w:t>
+      </w:r>
+    </w:p>
+    <w:p>
+      <w:pPr>
+        <w:pStyle w:val="Paragraphedeliste"/>
+        <w:numPr>
+          <w:ilvl w:val="0"/>
+          <w:numId w:val="1"/>
+        </w:numPr>
+        <w:spacing w:after="0" w:line="0" w:lineRule="atLeast"/>
+      </w:pPr>
+      <w:r>
         <w:lastRenderedPageBreak/>
-        <w:t>toutes</w:t>
-      </w:r>
-      <w:proofErr w:type="gramEnd"/>
-      <w:r>
-        <w:rPr>
-          <w:b/>
-          <w:bCs/>
-        </w:rPr>
-        <w:t xml:space="preserve"> les modifications dans l'ordre.</w:t>
-      </w:r>
-    </w:p>
-    <w:p>
-      <w:pPr>
-        <w:spacing w:after="0" w:line="0" w:lineRule="atLeast"/>
-        <w:rPr>
-          <w:b/>
-          <w:bCs/>
-        </w:rPr>
-      </w:pPr>
-      <w:r>
-        <w:rPr>
-          <w:b/>
-          <w:bCs/>
-        </w:rPr>
-        <w:t xml:space="preserve">Migrations SQL : créer les fichiers </w:t>
-      </w:r>
-    </w:p>
-    <w:p>
-      <w:pPr>
-        <w:spacing w:after="0" w:line="0" w:lineRule="atLeast"/>
-        <w:rPr>
-          <w:b/>
-          <w:bCs/>
-        </w:rPr>
-      </w:pPr>
-      <w:proofErr w:type="gramStart"/>
-      <w:r>
-        <w:rPr>
-          <w:b/>
-          <w:bCs/>
-        </w:rPr>
-        <w:t>sans</w:t>
-      </w:r>
-      <w:proofErr w:type="gramEnd"/>
-      <w:r>
-        <w:rPr>
-          <w:b/>
-          <w:bCs/>
-        </w:rPr>
-        <w:t xml:space="preserve"> les exécuter.</w:t>
-      </w:r>
-    </w:p>
-    <w:p>
-      <w:pPr>
-        <w:spacing w:after="0" w:line="0" w:lineRule="atLeast"/>
-        <w:rPr>
-          <w:b/>
-          <w:bCs/>
-        </w:rPr>
-      </w:pPr>
-      <w:proofErr w:type="spellStart"/>
-      <w:r>
-        <w:rPr>
-          <w:b/>
-          <w:bCs/>
-        </w:rPr>
-        <w:t>Committe</w:t>
-      </w:r>
-      <w:proofErr w:type="spellEnd"/>
-      <w:r>
-        <w:rPr>
-          <w:b/>
-          <w:bCs/>
-        </w:rPr>
-        <w:t xml:space="preserve"> et pousse après chaque point.</w:t>
-      </w:r>
-    </w:p>
-    <w:p/>
+        <w:t>Pas fluide, on clique sur une réunion, cela nous emmener dans la page du chantier mais nous ne pouvons plus faire retour arrière. Que conseil tu comme amélioration ?</w:t>
+      </w:r>
+    </w:p>
     <w:sectPr>
       <w:pgSz w:w="11906" w:h="16838"/>
       <w:pgMar w:top="1417" w:right="1417" w:bottom="1417" w:left="1417" w:header="708" w:footer="708" w:gutter="0"/>
@@ -840,6 +384,241 @@
     </w:sectPr>
   </w:body>
 </w:document>
+</file>
+
+<file path=word/numbering.xml><?xml version="1.0" encoding="utf-8"?>
+<w:numbering xmlns:wpc="http://schemas.microsoft.com/office/word/2010/wordprocessingCanvas" xmlns:cx="http://schemas.microsoft.com/office/drawing/2014/chartex" xmlns:cx1="http://schemas.microsoft.com/office/drawing/2015/9/8/chartex" xmlns:cx2="http://schemas.microsoft.com/office/drawing/2015/10/21/chartex" xmlns:cx3="http://schemas.microsoft.com/office/drawing/2016/5/9/chartex" xmlns:cx4="http://schemas.microsoft.com/office/drawing/2016/5/10/chartex" xmlns:cx5="http://schemas.microsoft.com/office/drawing/2016/5/11/chartex" xmlns:cx6="http://schemas.microsoft.com/office/drawing/2016/5/12/chartex" xmlns:cx7="http://schemas.microsoft.com/office/drawing/2016/5/13/chartex" xmlns:cx8="http://schemas.microsoft.com/office/drawing/2016/5/14/chartex" xmlns:mc="http://schemas.openxmlformats.org/markup-compatibility/2006" xmlns:aink="http://schemas.microsoft.com/office/drawing/2016/ink" xmlns:am3d="http://schemas.microsoft.com/office/drawing/2017/model3d" xmlns:o="urn:schemas-microsoft-com:office:office" xmlns:oel="http://schemas.microsoft.com/office/2019/extlst" xmlns:r="http://schemas.openxmlformats.org/officeDocument/2006/relationships" xmlns:m="http://schemas.openxmlformats.org/officeDocument/2006/math" xmlns:v="urn:schemas-microsoft-com:vml" xmlns:wp14="http://schemas.microsoft.com/office/word/2010/wordprocessingDrawing" xmlns:wp="http://schemas.openxmlformats.org/drawingml/2006/wordprocessingDrawing" xmlns:w10="urn:schemas-microsoft-com:office:word" xmlns:w="http://schemas.openxmlformats.org/wordprocessingml/2006/main" xmlns:w14="http://schemas.microsoft.com/office/word/2010/wordml" xmlns:w15="http://schemas.microsoft.com/office/word/2012/wordml" xmlns:w16cex="http://schemas.microsoft.com/office/word/2018/wordml/cex" xmlns:w16cid="http://schemas.microsoft.com/office/word/2016/wordml/cid" xmlns:w16="http://schemas.microsoft.com/office/word/2018/wordml" xmlns:w16du="http://schemas.microsoft.com/office/word/2023/wordml/word16du" xmlns:w16sdtdh="http://schemas.microsoft.com/office/word/2020/wordml/sdtdatahash" xmlns:w16sdtfl="http://schemas.microsoft.com/office/word/2024/wordml/sdtformatlock" xmlns:w16se="http://schemas.microsoft.com/office/word/2015/wordml/symex" xmlns:wpg="http://schemas.microsoft.com/office/word/2010/wordprocessingGroup" xmlns:wpi="http://schemas.microsoft.com/office/word/2010/wordprocessingInk" xmlns:wne="http://schemas.microsoft.com/office/word/2006/wordml" xmlns:wps="http://schemas.microsoft.com/office/word/2010/wordprocessingShape" mc:Ignorable="w14 w15 w16se w16cid w16 w16cex w16sdtdh w16sdtfl w16du wp14">
+  <w:abstractNum w:abstractNumId="0" w15:restartNumberingAfterBreak="0">
+    <w:nsid w:val="6854328E"/>
+    <w:multiLevelType w:val="hybridMultilevel"/>
+    <w:tmpl w:val="F71CACD8"/>
+    <w:lvl w:ilvl="0" w:tplc="C470A478">
+      <w:numFmt w:val="bullet"/>
+      <w:lvlText w:val="-"/>
+      <w:lvlJc w:val="left"/>
+      <w:pPr>
+        <w:ind w:left="720" w:hanging="360"/>
+      </w:pPr>
+      <w:rPr>
+        <w:rFonts w:ascii="Aptos" w:eastAsiaTheme="minorHAnsi" w:hAnsi="Aptos" w:cstheme="minorBidi" w:hint="default"/>
+      </w:rPr>
+    </w:lvl>
+    <w:lvl w:ilvl="1" w:tplc="040C0003" w:tentative="1">
+      <w:start w:val="1"/>
+      <w:numFmt w:val="bullet"/>
+      <w:lvlText w:val="o"/>
+      <w:lvlJc w:val="left"/>
+      <w:pPr>
+        <w:ind w:left="1440" w:hanging="360"/>
+      </w:pPr>
+      <w:rPr>
+        <w:rFonts w:ascii="Courier New" w:hAnsi="Courier New" w:cs="Courier New" w:hint="default"/>
+      </w:rPr>
+    </w:lvl>
+    <w:lvl w:ilvl="2" w:tplc="040C0005" w:tentative="1">
+      <w:start w:val="1"/>
+      <w:numFmt w:val="bullet"/>
+      <w:lvlText w:val=""/>
+      <w:lvlJc w:val="left"/>
+      <w:pPr>
+        <w:ind w:left="2160" w:hanging="360"/>
+      </w:pPr>
+      <w:rPr>
+        <w:rFonts w:ascii="Wingdings" w:hAnsi="Wingdings" w:hint="default"/>
+      </w:rPr>
+    </w:lvl>
+    <w:lvl w:ilvl="3" w:tplc="040C0001" w:tentative="1">
+      <w:start w:val="1"/>
+      <w:numFmt w:val="bullet"/>
+      <w:lvlText w:val=""/>
+      <w:lvlJc w:val="left"/>
+      <w:pPr>
+        <w:ind w:left="2880" w:hanging="360"/>
+      </w:pPr>
+      <w:rPr>
+        <w:rFonts w:ascii="Symbol" w:hAnsi="Symbol" w:hint="default"/>
+      </w:rPr>
+    </w:lvl>
+    <w:lvl w:ilvl="4" w:tplc="040C0003" w:tentative="1">
+      <w:start w:val="1"/>
+      <w:numFmt w:val="bullet"/>
+      <w:lvlText w:val="o"/>
+      <w:lvlJc w:val="left"/>
+      <w:pPr>
+        <w:ind w:left="3600" w:hanging="360"/>
+      </w:pPr>
+      <w:rPr>
+        <w:rFonts w:ascii="Courier New" w:hAnsi="Courier New" w:cs="Courier New" w:hint="default"/>
+      </w:rPr>
+    </w:lvl>
+    <w:lvl w:ilvl="5" w:tplc="040C0005" w:tentative="1">
+      <w:start w:val="1"/>
+      <w:numFmt w:val="bullet"/>
+      <w:lvlText w:val=""/>
+      <w:lvlJc w:val="left"/>
+      <w:pPr>
+        <w:ind w:left="4320" w:hanging="360"/>
+      </w:pPr>
+      <w:rPr>
+        <w:rFonts w:ascii="Wingdings" w:hAnsi="Wingdings" w:hint="default"/>
+      </w:rPr>
+    </w:lvl>
+    <w:lvl w:ilvl="6" w:tplc="040C0001" w:tentative="1">
+      <w:start w:val="1"/>
+      <w:numFmt w:val="bullet"/>
+      <w:lvlText w:val=""/>
+      <w:lvlJc w:val="left"/>
+      <w:pPr>
+        <w:ind w:left="5040" w:hanging="360"/>
+      </w:pPr>
+      <w:rPr>
+        <w:rFonts w:ascii="Symbol" w:hAnsi="Symbol" w:hint="default"/>
+      </w:rPr>
+    </w:lvl>
+    <w:lvl w:ilvl="7" w:tplc="040C0003" w:tentative="1">
+      <w:start w:val="1"/>
+      <w:numFmt w:val="bullet"/>
+      <w:lvlText w:val="o"/>
+      <w:lvlJc w:val="left"/>
+      <w:pPr>
+        <w:ind w:left="5760" w:hanging="360"/>
+      </w:pPr>
+      <w:rPr>
+        <w:rFonts w:ascii="Courier New" w:hAnsi="Courier New" w:cs="Courier New" w:hint="default"/>
+      </w:rPr>
+    </w:lvl>
+    <w:lvl w:ilvl="8" w:tplc="040C0005" w:tentative="1">
+      <w:start w:val="1"/>
+      <w:numFmt w:val="bullet"/>
+      <w:lvlText w:val=""/>
+      <w:lvlJc w:val="left"/>
+      <w:pPr>
+        <w:ind w:left="6480" w:hanging="360"/>
+      </w:pPr>
+      <w:rPr>
+        <w:rFonts w:ascii="Wingdings" w:hAnsi="Wingdings" w:hint="default"/>
+      </w:rPr>
+    </w:lvl>
+  </w:abstractNum>
+  <w:abstractNum w:abstractNumId="1" w15:restartNumberingAfterBreak="0">
+    <w:nsid w:val="6B6847D8"/>
+    <w:multiLevelType w:val="hybridMultilevel"/>
+    <w:tmpl w:val="CBF654D4"/>
+    <w:lvl w:ilvl="0" w:tplc="CE82C8D2">
+      <w:numFmt w:val="bullet"/>
+      <w:lvlText w:val="-"/>
+      <w:lvlJc w:val="left"/>
+      <w:pPr>
+        <w:ind w:left="720" w:hanging="360"/>
+      </w:pPr>
+      <w:rPr>
+        <w:rFonts w:ascii="Aptos" w:eastAsiaTheme="minorHAnsi" w:hAnsi="Aptos" w:cstheme="minorBidi" w:hint="default"/>
+      </w:rPr>
+    </w:lvl>
+    <w:lvl w:ilvl="1" w:tplc="040C0003" w:tentative="1">
+      <w:start w:val="1"/>
+      <w:numFmt w:val="bullet"/>
+      <w:lvlText w:val="o"/>
+      <w:lvlJc w:val="left"/>
+      <w:pPr>
+        <w:ind w:left="1440" w:hanging="360"/>
+      </w:pPr>
+      <w:rPr>
+        <w:rFonts w:ascii="Courier New" w:hAnsi="Courier New" w:cs="Courier New" w:hint="default"/>
+      </w:rPr>
+    </w:lvl>
+    <w:lvl w:ilvl="2" w:tplc="040C0005" w:tentative="1">
+      <w:start w:val="1"/>
+      <w:numFmt w:val="bullet"/>
+      <w:lvlText w:val=""/>
+      <w:lvlJc w:val="left"/>
+      <w:pPr>
+        <w:ind w:left="2160" w:hanging="360"/>
+      </w:pPr>
+      <w:rPr>
+        <w:rFonts w:ascii="Wingdings" w:hAnsi="Wingdings" w:hint="default"/>
+      </w:rPr>
+    </w:lvl>
+    <w:lvl w:ilvl="3" w:tplc="040C0001" w:tentative="1">
+      <w:start w:val="1"/>
+      <w:numFmt w:val="bullet"/>
+      <w:lvlText w:val=""/>
+      <w:lvlJc w:val="left"/>
+      <w:pPr>
+        <w:ind w:left="2880" w:hanging="360"/>
+      </w:pPr>
+      <w:rPr>
+        <w:rFonts w:ascii="Symbol" w:hAnsi="Symbol" w:hint="default"/>
+      </w:rPr>
+    </w:lvl>
+    <w:lvl w:ilvl="4" w:tplc="040C0003" w:tentative="1">
+      <w:start w:val="1"/>
+      <w:numFmt w:val="bullet"/>
+      <w:lvlText w:val="o"/>
+      <w:lvlJc w:val="left"/>
+      <w:pPr>
+        <w:ind w:left="3600" w:hanging="360"/>
+      </w:pPr>
+      <w:rPr>
+        <w:rFonts w:ascii="Courier New" w:hAnsi="Courier New" w:cs="Courier New" w:hint="default"/>
+      </w:rPr>
+    </w:lvl>
+    <w:lvl w:ilvl="5" w:tplc="040C0005" w:tentative="1">
+      <w:start w:val="1"/>
+      <w:numFmt w:val="bullet"/>
+      <w:lvlText w:val=""/>
+      <w:lvlJc w:val="left"/>
+      <w:pPr>
+        <w:ind w:left="4320" w:hanging="360"/>
+      </w:pPr>
+      <w:rPr>
+        <w:rFonts w:ascii="Wingdings" w:hAnsi="Wingdings" w:hint="default"/>
+      </w:rPr>
+    </w:lvl>
+    <w:lvl w:ilvl="6" w:tplc="040C0001" w:tentative="1">
+      <w:start w:val="1"/>
+      <w:numFmt w:val="bullet"/>
+      <w:lvlText w:val=""/>
+      <w:lvlJc w:val="left"/>
+      <w:pPr>
+        <w:ind w:left="5040" w:hanging="360"/>
+      </w:pPr>
+      <w:rPr>
+        <w:rFonts w:ascii="Symbol" w:hAnsi="Symbol" w:hint="default"/>
+      </w:rPr>
+    </w:lvl>
+    <w:lvl w:ilvl="7" w:tplc="040C0003" w:tentative="1">
+      <w:start w:val="1"/>
+      <w:numFmt w:val="bullet"/>
+      <w:lvlText w:val="o"/>
+      <w:lvlJc w:val="left"/>
+      <w:pPr>
+        <w:ind w:left="5760" w:hanging="360"/>
+      </w:pPr>
+      <w:rPr>
+        <w:rFonts w:ascii="Courier New" w:hAnsi="Courier New" w:cs="Courier New" w:hint="default"/>
+      </w:rPr>
+    </w:lvl>
+    <w:lvl w:ilvl="8" w:tplc="040C0005" w:tentative="1">
+      <w:start w:val="1"/>
+      <w:numFmt w:val="bullet"/>
+      <w:lvlText w:val=""/>
+      <w:lvlJc w:val="left"/>
+      <w:pPr>
+        <w:ind w:left="6480" w:hanging="360"/>
+      </w:pPr>
+      <w:rPr>
+        <w:rFonts w:ascii="Wingdings" w:hAnsi="Wingdings" w:hint="default"/>
+      </w:rPr>
+    </w:lvl>
+  </w:abstractNum>
+  <w:num w:numId="1" w16cid:durableId="887911817">
+    <w:abstractNumId w:val="1"/>
+  </w:num>
+  <w:num w:numId="2" w16cid:durableId="1271234297">
+    <w:abstractNumId w:val="0"/>
+  </w:num>
+</w:numbering>
 </file>
 
 <file path=word/styles.xml><?xml version="1.0" encoding="utf-8"?>
@@ -1242,7 +1021,7 @@
   <w:style w:type="paragraph" w:default="1" w:styleId="Normal">
     <w:name w:val="Normal"/>
     <w:qFormat/>
-    <w:rsid w:val="009D2CB7"/>
+    <w:rsid w:val="00F979AD"/>
   </w:style>
   <w:style w:type="paragraph" w:styleId="Titre1">
     <w:name w:val="heading 1"/>

</xml_diff>